<commit_message>
Matriz de trazabilidad y estados al día con las pantallas del 2026-10-16
La matriz pasa a APROBADO en REQ-F-010, 013, 032, 033 y 034 (pantallas de
Mi cuenta, contacto, reportes y auditoría, con pruebas unitarias y E2E).
REQ-F-011 queda aprobado por API: su formulario no se recorrió en la
prueba de interfaz. Se actualizan las frases de estado en requerimientos,
análisis, diseño, desarrollo, pruebas y el manual de usuario, y se
regeneran sus versiones Word (validadas abriéndolas con Word).

Co-Authored-By: Claude Opus 5.5 <noreply@anthropic.com>
</commit_message>
<xml_diff>
--- a/00_GESTION_DEL_PROYECTO/03_OBJETIVOS_Y_ALCANCE.docx
+++ b/00_GESTION_DEL_PROYECTO/03_OBJETIVOS_Y_ALCANCE.docx
@@ -2212,9 +2212,9 @@
         <w:tblLayout w:type="fixed"/>
       </w:tblPr>
       <w:tblGrid>
-        <w:gridCol w:w="4144"/>
-        <w:gridCol w:w="2935"/>
-        <w:gridCol w:w="2281"/>
+        <w:gridCol w:w="3608"/>
+        <w:gridCol w:w="3545"/>
+        <w:gridCol w:w="2207"/>
       </w:tblGrid>
       <w:tr>
         <w:trPr>
@@ -2222,7 +2222,7 @@
         </w:trPr>
         <w:tc>
           <w:tcPr>
-            <w:tcW w:type="dxa" w:w="4144"/>
+            <w:tcW w:type="dxa" w:w="3608"/>
             <w:tcBorders>
               <w:top w:val="single" w:color="CBD5E1" w:sz="4"/>
               <w:left w:val="single" w:color="CBD5E1" w:sz="4"/>
@@ -2252,7 +2252,7 @@
         </w:tc>
         <w:tc>
           <w:tcPr>
-            <w:tcW w:type="dxa" w:w="2935"/>
+            <w:tcW w:type="dxa" w:w="3545"/>
             <w:tcBorders>
               <w:top w:val="single" w:color="CBD5E1" w:sz="4"/>
               <w:left w:val="single" w:color="CBD5E1" w:sz="4"/>
@@ -2282,7 +2282,7 @@
         </w:tc>
         <w:tc>
           <w:tcPr>
-            <w:tcW w:type="dxa" w:w="2281"/>
+            <w:tcW w:type="dxa" w:w="2207"/>
             <w:tcBorders>
               <w:top w:val="single" w:color="CBD5E1" w:sz="4"/>
               <w:left w:val="single" w:color="CBD5E1" w:sz="4"/>
@@ -2314,7 +2314,7 @@
       <w:tr>
         <w:tc>
           <w:tcPr>
-            <w:tcW w:type="dxa" w:w="4144"/>
+            <w:tcW w:type="dxa" w:w="3608"/>
             <w:tcBorders>
               <w:top w:val="single" w:color="CBD5E1" w:sz="4"/>
               <w:left w:val="single" w:color="CBD5E1" w:sz="4"/>
@@ -2341,34 +2341,34 @@
         </w:tc>
         <w:tc>
           <w:tcPr>
-            <w:tcW w:type="dxa" w:w="2935"/>
-            <w:tcBorders>
-              <w:top w:val="single" w:color="CBD5E1" w:sz="4"/>
-              <w:left w:val="single" w:color="CBD5E1" w:sz="4"/>
-              <w:bottom w:val="single" w:color="CBD5E1" w:sz="4"/>
-              <w:right w:val="single" w:color="CBD5E1" w:sz="4"/>
-            </w:tcBorders>
-            <w:tcMar>
-              <w:top w:type="dxa" w:w="60"/>
-              <w:left w:type="dxa" w:w="90"/>
-              <w:bottom w:type="dxa" w:w="60"/>
-              <w:right w:type="dxa" w:w="90"/>
-            </w:tcMar>
-            <w:vAlign w:val="top"/>
-          </w:tcPr>
-          <w:p>
-            <w:r>
-              <w:rPr>
-                <w:sz w:val="17"/>
-                <w:szCs w:val="17"/>
-              </w:rPr>
-              <w:t xml:space="preserve">PARCIALMENTE IMPLEMENTADO</w:t>
-            </w:r>
-          </w:p>
-        </w:tc>
-        <w:tc>
-          <w:tcPr>
-            <w:tcW w:type="dxa" w:w="2281"/>
+            <w:tcW w:type="dxa" w:w="3545"/>
+            <w:tcBorders>
+              <w:top w:val="single" w:color="CBD5E1" w:sz="4"/>
+              <w:left w:val="single" w:color="CBD5E1" w:sz="4"/>
+              <w:bottom w:val="single" w:color="CBD5E1" w:sz="4"/>
+              <w:right w:val="single" w:color="CBD5E1" w:sz="4"/>
+            </w:tcBorders>
+            <w:tcMar>
+              <w:top w:type="dxa" w:w="60"/>
+              <w:left w:type="dxa" w:w="90"/>
+              <w:bottom w:type="dxa" w:w="60"/>
+              <w:right w:type="dxa" w:w="90"/>
+            </w:tcMar>
+            <w:vAlign w:val="top"/>
+          </w:tcPr>
+          <w:p>
+            <w:r>
+              <w:rPr>
+                <w:sz w:val="17"/>
+                <w:szCs w:val="17"/>
+              </w:rPr>
+              <w:t xml:space="preserve">IMPLEMENTADO Y VERIFICADO (2026-10-16; el formulario de cambio de correo no se recorrió en la prueba de interfaz)</w:t>
+            </w:r>
+          </w:p>
+        </w:tc>
+        <w:tc>
+          <w:tcPr>
+            <w:tcW w:type="dxa" w:w="2207"/>
             <w:tcBorders>
               <w:top w:val="single" w:color="CBD5E1" w:sz="4"/>
               <w:left w:val="single" w:color="CBD5E1" w:sz="4"/>
@@ -2393,7 +2393,7 @@
               <w:noBreakHyphen/>
               <w:t xml:space="preserve">004, BUG</w:t>
               <w:noBreakHyphen/>
-              <w:t xml:space="preserve">005</w:t>
+              <w:t xml:space="preserve">005 corregidos</w:t>
             </w:r>
           </w:p>
         </w:tc>
@@ -2401,7 +2401,7 @@
       <w:tr>
         <w:tc>
           <w:tcPr>
-            <w:tcW w:type="dxa" w:w="4144"/>
+            <w:tcW w:type="dxa" w:w="3608"/>
             <w:tcBorders>
               <w:top w:val="single" w:color="CBD5E1" w:sz="4"/>
               <w:left w:val="single" w:color="CBD5E1" w:sz="4"/>
@@ -2428,7 +2428,7 @@
         </w:tc>
         <w:tc>
           <w:tcPr>
-            <w:tcW w:type="dxa" w:w="2935"/>
+            <w:tcW w:type="dxa" w:w="3545"/>
             <w:tcBorders>
               <w:top w:val="single" w:color="CBD5E1" w:sz="4"/>
               <w:left w:val="single" w:color="CBD5E1" w:sz="4"/>
@@ -2455,7 +2455,7 @@
         </w:tc>
         <w:tc>
           <w:tcPr>
-            <w:tcW w:type="dxa" w:w="2281"/>
+            <w:tcW w:type="dxa" w:w="2207"/>
             <w:tcBorders>
               <w:top w:val="single" w:color="CBD5E1" w:sz="4"/>
               <w:left w:val="single" w:color="CBD5E1" w:sz="4"/>
@@ -2486,7 +2486,7 @@
       <w:tr>
         <w:tc>
           <w:tcPr>
-            <w:tcW w:type="dxa" w:w="4144"/>
+            <w:tcW w:type="dxa" w:w="3608"/>
             <w:tcBorders>
               <w:top w:val="single" w:color="CBD5E1" w:sz="4"/>
               <w:left w:val="single" w:color="CBD5E1" w:sz="4"/>
@@ -2513,7 +2513,7 @@
         </w:tc>
         <w:tc>
           <w:tcPr>
-            <w:tcW w:type="dxa" w:w="2935"/>
+            <w:tcW w:type="dxa" w:w="3545"/>
             <w:tcBorders>
               <w:top w:val="single" w:color="CBD5E1" w:sz="4"/>
               <w:left w:val="single" w:color="CBD5E1" w:sz="4"/>
@@ -2540,7 +2540,7 @@
         </w:tc>
         <w:tc>
           <w:tcPr>
-            <w:tcW w:type="dxa" w:w="2281"/>
+            <w:tcW w:type="dxa" w:w="2207"/>
             <w:tcBorders>
               <w:top w:val="single" w:color="CBD5E1" w:sz="4"/>
               <w:left w:val="single" w:color="CBD5E1" w:sz="4"/>
@@ -2573,7 +2573,7 @@
       <w:tr>
         <w:tc>
           <w:tcPr>
-            <w:tcW w:type="dxa" w:w="4144"/>
+            <w:tcW w:type="dxa" w:w="3608"/>
             <w:tcBorders>
               <w:top w:val="single" w:color="CBD5E1" w:sz="4"/>
               <w:left w:val="single" w:color="CBD5E1" w:sz="4"/>
@@ -2600,7 +2600,7 @@
         </w:tc>
         <w:tc>
           <w:tcPr>
-            <w:tcW w:type="dxa" w:w="2935"/>
+            <w:tcW w:type="dxa" w:w="3545"/>
             <w:tcBorders>
               <w:top w:val="single" w:color="CBD5E1" w:sz="4"/>
               <w:left w:val="single" w:color="CBD5E1" w:sz="4"/>
@@ -2627,7 +2627,7 @@
         </w:tc>
         <w:tc>
           <w:tcPr>
-            <w:tcW w:type="dxa" w:w="2281"/>
+            <w:tcW w:type="dxa" w:w="2207"/>
             <w:tcBorders>
               <w:top w:val="single" w:color="CBD5E1" w:sz="4"/>
               <w:left w:val="single" w:color="CBD5E1" w:sz="4"/>
@@ -2660,7 +2660,7 @@
       <w:tr>
         <w:tc>
           <w:tcPr>
-            <w:tcW w:type="dxa" w:w="4144"/>
+            <w:tcW w:type="dxa" w:w="3608"/>
             <w:tcBorders>
               <w:top w:val="single" w:color="CBD5E1" w:sz="4"/>
               <w:left w:val="single" w:color="CBD5E1" w:sz="4"/>
@@ -2687,7 +2687,7 @@
         </w:tc>
         <w:tc>
           <w:tcPr>
-            <w:tcW w:type="dxa" w:w="2935"/>
+            <w:tcW w:type="dxa" w:w="3545"/>
             <w:tcBorders>
               <w:top w:val="single" w:color="CBD5E1" w:sz="4"/>
               <w:left w:val="single" w:color="CBD5E1" w:sz="4"/>
@@ -2714,7 +2714,7 @@
         </w:tc>
         <w:tc>
           <w:tcPr>
-            <w:tcW w:type="dxa" w:w="2281"/>
+            <w:tcW w:type="dxa" w:w="2207"/>
             <w:tcBorders>
               <w:top w:val="single" w:color="CBD5E1" w:sz="4"/>
               <w:left w:val="single" w:color="CBD5E1" w:sz="4"/>
@@ -2747,7 +2747,7 @@
       <w:tr>
         <w:tc>
           <w:tcPr>
-            <w:tcW w:type="dxa" w:w="4144"/>
+            <w:tcW w:type="dxa" w:w="3608"/>
             <w:tcBorders>
               <w:top w:val="single" w:color="CBD5E1" w:sz="4"/>
               <w:left w:val="single" w:color="CBD5E1" w:sz="4"/>
@@ -2774,7 +2774,7 @@
         </w:tc>
         <w:tc>
           <w:tcPr>
-            <w:tcW w:type="dxa" w:w="2935"/>
+            <w:tcW w:type="dxa" w:w="3545"/>
             <w:tcBorders>
               <w:top w:val="single" w:color="CBD5E1" w:sz="4"/>
               <w:left w:val="single" w:color="CBD5E1" w:sz="4"/>
@@ -2801,7 +2801,7 @@
         </w:tc>
         <w:tc>
           <w:tcPr>
-            <w:tcW w:type="dxa" w:w="2281"/>
+            <w:tcW w:type="dxa" w:w="2207"/>
             <w:tcBorders>
               <w:top w:val="single" w:color="CBD5E1" w:sz="4"/>
               <w:left w:val="single" w:color="CBD5E1" w:sz="4"/>
@@ -2978,7 +2978,7 @@
       <w:r>
         <w:t xml:space="preserve">PENDIENTE DE DEFINICIÓN por el patrocinador. Propuesta [REC]: criterios de aceptación de </w:t>
       </w:r>
-      <w:hyperlink w:history="1" r:id="rIdzygfpitci6p_6er2kkiyy">
+      <w:hyperlink w:history="1" r:id="rIdghunwngcvi-zgvj0a74do">
         <w:r>
           <w:rPr>
             <w:color w:val="1D4ED8"/>
@@ -2990,7 +2990,7 @@
       <w:r>
         <w:t xml:space="preserve"> aprobados, cero defectos altos abiertos y lista de </w:t>
       </w:r>
-      <w:hyperlink w:history="1" r:id="rIdl6mdwqrbaqmaxrhqe4tno">
+      <w:hyperlink w:history="1" r:id="rIdtdvtssykgd_sochhocxhh">
         <w:r>
           <w:rPr>
             <w:color w:val="1D4ED8"/>
@@ -3021,7 +3021,7 @@
         </w:numPr>
         <w:spacing w:after="40"/>
       </w:pPr>
-      <w:hyperlink w:history="1" r:id="rIdulgld0bm-dqw3f5qepjqa">
+      <w:hyperlink w:history="1" r:id="rId9xlaknesg7wby9na-cvra">
         <w:r>
           <w:rPr>
             <w:color w:val="1D4ED8"/>
@@ -3040,7 +3040,7 @@
         </w:numPr>
         <w:spacing w:after="40"/>
       </w:pPr>
-      <w:hyperlink w:history="1" r:id="rIdfrsegvnh1klmfaa7dy1ce">
+      <w:hyperlink w:history="1" r:id="rId6vu-uez4hndz2pfi38ilm">
         <w:r>
           <w:rPr>
             <w:color w:val="1D4ED8"/>
@@ -3059,7 +3059,7 @@
         </w:numPr>
         <w:spacing w:after="40"/>
       </w:pPr>
-      <w:hyperlink w:history="1" r:id="rId_bfifsu70qur13iopiuny">
+      <w:hyperlink w:history="1" r:id="rIdynbg3lwvnmwirplthaa2j">
         <w:r>
           <w:rPr>
             <w:color w:val="1D4ED8"/>

</xml_diff>